<commit_message>
Document the binary-column pitfall
Section 4 gains a "Rendering binary values" note explaining that a byte[]
stringifies to "System.Byte[]", so the grid, text view and CSV export all
route binary through CellFormat — with a design note on why grid blob
columns are read-only and why the cell style is based on the theme's
implicit TextBlock style. The pitfalls table gets a matching row beside
the related DataTable.Load entry.

Co-Authored-By: Claude Opus 4.8 <noreply@anthropic.com>
</commit_message>
<xml_diff>
--- a/docs/Qplus Technical Documentation.docx
+++ b/docs/Qplus Technical Documentation.docx
@@ -2595,6 +2595,44 @@
         <w:spacing w:after="120" w:before="280"/>
       </w:pPr>
       <w:r>
+        <w:t xml:space="preserve">Rendering binary values</w:t>
+      </w:r>
+    </w:p>
+    <w:p>
+      <w:pPr>
+        <w:spacing w:after="120"/>
+      </w:pPr>
+      <w:r>
+        <w:t xml:space="preserve">A varbinary, BLOB, RAW, LONG RAW, IMAGE or rowversion column arrives as a byte[]. Nothing calls ToString() on a byte array usefully — it returns the literal "System.Byte[]" — so every surface that turns a cell into text (the grid, the fixed-width text view and CSV export) routes binary values through Qplus.Core.CellFormat instead. It renders a size summary such as "[BLOB 1.2 KB]", leaves nulls and ordinary values untouched, and offers a hex preview for tooltips.</w:t>
+      </w:r>
+    </w:p>
+    <w:p>
+      <w:pPr>
+        <w:pBdr>
+          <w:left w:val="single" w:color="1F3864" w:sz="18" w:space="8"/>
+        </w:pBdr>
+        <w:shd w:fill="DEEAF6" w:color="auto" w:val="clear"/>
+        <w:spacing w:after="140" w:before="100"/>
+        <w:ind w:left="180" w:right="180"/>
+      </w:pPr>
+      <w:r>
+        <w:rPr>
+          <w:b/>
+          <w:bCs/>
+          <w:color w:val="1F3864"/>
+        </w:rPr>
+        <w:t xml:space="preserve">Design note  </w:t>
+      </w:r>
+      <w:r>
+        <w:t xml:space="preserve">In the data grid the binary column is also forced read-only. The auto-generated column is a text column, and letting a blob be typed over as a string would corrupt the bytes on save. Its cell style is based on the theme’s implicit TextBlock style so the themed foreground survives — a bare ElementStyle would drop it and make the cell unreadable in dark mode.</w:t>
+      </w:r>
+    </w:p>
+    <w:p>
+      <w:pPr>
+        <w:pStyle w:val="Heading2"/>
+        <w:spacing w:after="120" w:before="280"/>
+      </w:pPr>
+      <w:r>
         <w:t xml:space="preserve">Server messages</w:t>
       </w:r>
     </w:p>
@@ -6101,6 +6139,49 @@
                 <w:sz w:val="19"/>
                 <w:szCs w:val="19"/>
               </w:rPr>
+              <w:t xml:space="preserve">Binary columns</w:t>
+            </w:r>
+          </w:p>
+        </w:tc>
+        <w:tc>
+          <w:tcPr>
+            <w:tcW w:type="dxa" w:w="7560"/>
+            <w:tcMar>
+              <w:top w:type="dxa" w:w="60"/>
+              <w:left w:type="dxa" w:w="100"/>
+              <w:bottom w:type="dxa" w:w="60"/>
+              <w:right w:type="dxa" w:w="100"/>
+            </w:tcMar>
+          </w:tcPr>
+          <w:p>
+            <w:r>
+              <w:rPr>
+                <w:sz w:val="19"/>
+                <w:szCs w:val="19"/>
+              </w:rPr>
+              <w:t xml:space="preserve">A byte[] column stringifies to the literal "System.Byte[]" through ToString(). The grid, text view and CSV export all route binary through CellFormat, which shows a size summary; grid blob columns are forced read-only so a text edit cannot corrupt the bytes (see section 4).</w:t>
+            </w:r>
+          </w:p>
+        </w:tc>
+      </w:tr>
+      <w:tr>
+        <w:tc>
+          <w:tcPr>
+            <w:tcW w:type="dxa" w:w="1800"/>
+            <w:shd w:fill="F7F9FC" w:color="auto" w:val="clear"/>
+            <w:tcMar>
+              <w:top w:type="dxa" w:w="60"/>
+              <w:left w:type="dxa" w:w="100"/>
+              <w:bottom w:type="dxa" w:w="60"/>
+              <w:right w:type="dxa" w:w="100"/>
+            </w:tcMar>
+          </w:tcPr>
+          <w:p>
+            <w:r>
+              <w:rPr>
+                <w:sz w:val="19"/>
+                <w:szCs w:val="19"/>
+              </w:rPr>
               <w:t xml:space="preserve">WPF theming</w:t>
             </w:r>
           </w:p>
@@ -6108,6 +6189,7 @@
         <w:tc>
           <w:tcPr>
             <w:tcW w:type="dxa" w:w="7560"/>
+            <w:shd w:fill="F7F9FC" w:color="auto" w:val="clear"/>
             <w:tcMar>
               <w:top w:type="dxa" w:w="60"/>
               <w:left w:type="dxa" w:w="100"/>
@@ -6130,7 +6212,6 @@
         <w:tc>
           <w:tcPr>
             <w:tcW w:type="dxa" w:w="1800"/>
-            <w:shd w:fill="F7F9FC" w:color="auto" w:val="clear"/>
             <w:tcMar>
               <w:top w:type="dxa" w:w="60"/>
               <w:left w:type="dxa" w:w="100"/>
@@ -6151,7 +6232,6 @@
         <w:tc>
           <w:tcPr>
             <w:tcW w:type="dxa" w:w="7560"/>
-            <w:shd w:fill="F7F9FC" w:color="auto" w:val="clear"/>
             <w:tcMar>
               <w:top w:type="dxa" w:w="60"/>
               <w:left w:type="dxa" w:w="100"/>
@@ -6174,6 +6254,7 @@
         <w:tc>
           <w:tcPr>
             <w:tcW w:type="dxa" w:w="1800"/>
+            <w:shd w:fill="F7F9FC" w:color="auto" w:val="clear"/>
             <w:tcMar>
               <w:top w:type="dxa" w:w="60"/>
               <w:left w:type="dxa" w:w="100"/>
@@ -6194,6 +6275,7 @@
         <w:tc>
           <w:tcPr>
             <w:tcW w:type="dxa" w:w="7560"/>
+            <w:shd w:fill="F7F9FC" w:color="auto" w:val="clear"/>
             <w:tcMar>
               <w:top w:type="dxa" w:w="60"/>
               <w:left w:type="dxa" w:w="100"/>
@@ -6216,7 +6298,6 @@
         <w:tc>
           <w:tcPr>
             <w:tcW w:type="dxa" w:w="1800"/>
-            <w:shd w:fill="F7F9FC" w:color="auto" w:val="clear"/>
             <w:tcMar>
               <w:top w:type="dxa" w:w="60"/>
               <w:left w:type="dxa" w:w="100"/>
@@ -6237,7 +6318,6 @@
         <w:tc>
           <w:tcPr>
             <w:tcW w:type="dxa" w:w="7560"/>
-            <w:shd w:fill="F7F9FC" w:color="auto" w:val="clear"/>
             <w:tcMar>
               <w:top w:type="dxa" w:w="60"/>
               <w:left w:type="dxa" w:w="100"/>
@@ -6260,6 +6340,7 @@
         <w:tc>
           <w:tcPr>
             <w:tcW w:type="dxa" w:w="1800"/>
+            <w:shd w:fill="F7F9FC" w:color="auto" w:val="clear"/>
             <w:tcMar>
               <w:top w:type="dxa" w:w="60"/>
               <w:left w:type="dxa" w:w="100"/>
@@ -6280,6 +6361,7 @@
         <w:tc>
           <w:tcPr>
             <w:tcW w:type="dxa" w:w="7560"/>
+            <w:shd w:fill="F7F9FC" w:color="auto" w:val="clear"/>
             <w:tcMar>
               <w:top w:type="dxa" w:w="60"/>
               <w:left w:type="dxa" w:w="100"/>
@@ -6302,7 +6384,6 @@
         <w:tc>
           <w:tcPr>
             <w:tcW w:type="dxa" w:w="1800"/>
-            <w:shd w:fill="F7F9FC" w:color="auto" w:val="clear"/>
             <w:tcMar>
               <w:top w:type="dxa" w:w="60"/>
               <w:left w:type="dxa" w:w="100"/>
@@ -6323,7 +6404,6 @@
         <w:tc>
           <w:tcPr>
             <w:tcW w:type="dxa" w:w="7560"/>
-            <w:shd w:fill="F7F9FC" w:color="auto" w:val="clear"/>
             <w:tcMar>
               <w:top w:type="dxa" w:w="60"/>
               <w:left w:type="dxa" w:w="100"/>
@@ -6346,6 +6426,7 @@
         <w:tc>
           <w:tcPr>
             <w:tcW w:type="dxa" w:w="1800"/>
+            <w:shd w:fill="F7F9FC" w:color="auto" w:val="clear"/>
             <w:tcMar>
               <w:top w:type="dxa" w:w="60"/>
               <w:left w:type="dxa" w:w="100"/>
@@ -6366,6 +6447,7 @@
         <w:tc>
           <w:tcPr>
             <w:tcW w:type="dxa" w:w="7560"/>
+            <w:shd w:fill="F7F9FC" w:color="auto" w:val="clear"/>
             <w:tcMar>
               <w:top w:type="dxa" w:w="60"/>
               <w:left w:type="dxa" w:w="100"/>
@@ -6388,7 +6470,6 @@
         <w:tc>
           <w:tcPr>
             <w:tcW w:type="dxa" w:w="1800"/>
-            <w:shd w:fill="F7F9FC" w:color="auto" w:val="clear"/>
             <w:tcMar>
               <w:top w:type="dxa" w:w="60"/>
               <w:left w:type="dxa" w:w="100"/>
@@ -6409,7 +6490,6 @@
         <w:tc>
           <w:tcPr>
             <w:tcW w:type="dxa" w:w="7560"/>
-            <w:shd w:fill="F7F9FC" w:color="auto" w:val="clear"/>
             <w:tcMar>
               <w:top w:type="dxa" w:w="60"/>
               <w:left w:type="dxa" w:w="100"/>
@@ -6432,6 +6512,7 @@
         <w:tc>
           <w:tcPr>
             <w:tcW w:type="dxa" w:w="1800"/>
+            <w:shd w:fill="F7F9FC" w:color="auto" w:val="clear"/>
             <w:tcMar>
               <w:top w:type="dxa" w:w="60"/>
               <w:left w:type="dxa" w:w="100"/>
@@ -6452,6 +6533,7 @@
         <w:tc>
           <w:tcPr>
             <w:tcW w:type="dxa" w:w="7560"/>
+            <w:shd w:fill="F7F9FC" w:color="auto" w:val="clear"/>
             <w:tcMar>
               <w:top w:type="dxa" w:w="60"/>
               <w:left w:type="dxa" w:w="100"/>

</xml_diff>

<commit_message>
Document the binary-value viewer
User guide: a new "Inspecting binary values" subsection under Working with
results — double-click a binary cell for a hex/ASCII dump, an image
preview for recognised formats, and Save as… to extract the raw bytes —
plus a pointer from the data-editing section.

Technical documentation: section 4 gains a paragraph on BlobViewerWindow
and BinarySniff (magic-byte detection, the 256 KB hex cap, the non-empty
byte[] double-click trigger, and SortMemberPath-with-binding-path-fallback
column resolution). The Views file list now lists BlobViewerWindow and
the previously missing FolderPromptDialog.

Rendered both changed pages; no overflow.

Co-Authored-By: Claude Opus 4.8 <noreply@anthropic.com>
</commit_message>
<xml_diff>
--- a/docs/Qplus Technical Documentation.docx
+++ b/docs/Qplus Technical Documentation.docx
@@ -1715,7 +1715,7 @@
                 <w:sz w:val="19"/>
                 <w:szCs w:val="19"/>
               </w:rPr>
-              <w:t xml:space="preserve">QueryDocumentView, TableDetailsView, ConnectionDialog, SaveQueryDialog, QueryLibraryDialog, SyncSettingsDialog, EncryptionDialog, TableDesignerDialog, UserManagementDialog, EditUserDialog</w:t>
+              <w:t xml:space="preserve">QueryDocumentView, TableDetailsView, BlobViewerWindow, ConnectionDialog, SaveQueryDialog, QueryLibraryDialog, FolderPromptDialog, SyncSettingsDialog, EncryptionDialog, TableDesignerDialog, UserManagementDialog, EditUserDialog</w:t>
             </w:r>
           </w:p>
         </w:tc>
@@ -2625,6 +2625,14 @@
       </w:r>
       <w:r>
         <w:t xml:space="preserve">In the data grid the binary column is also forced read-only. The auto-generated column is a text column, and letting a blob be typed over as a string would corrupt the bytes on save. Its cell style is based on the theme’s implicit TextBlock style so the themed foreground survives — a bare ElementStyle would drop it and make the cell unreadable in dark mode.</w:t>
+      </w:r>
+    </w:p>
+    <w:p>
+      <w:pPr>
+        <w:spacing w:after="120"/>
+      </w:pPr>
+      <w:r>
+        <w:t xml:space="preserve">Double-clicking a binary cell in either grid opens BlobViewerWindow, a read-only inspector. It shows a hex and ASCII dump — capped at 256 KB so a large value cannot stall the UI, with the whole value still available through Save as… — and, for a value BinarySniff recognises as an image, a rendered preview. BinarySniff identifies content from the leading "magic" bytes (PNG, JPEG, GIF, BMP, TIFF, ICO, PDF, ZIP or Office, and so on); the result labels the value and supplies the default extension when saving. The double-click trigger is simply that the cell holds a non-empty byte[], so ordinary cells are untouched, and the underlying column name is taken from the grid column’s SortMemberPath, falling back to the binding path so it survives column reordering.</w:t>
       </w:r>
     </w:p>
     <w:p>

</xml_diff>